<commit_message>
Add meeting preps, 1:1 notes, Milan itinerary, and session updates
Includes Rick Webb and Sean Brown meeting prep briefs, Tim Rayburn
1:1 notes, Milan June 2026 travel itinerary, Steve Hall plan updates,
memory and benefits tracker updates, and bridge message archival.

Co-Authored-By: Claude Opus 4.6 <noreply@anthropic.com>
</commit_message>
<xml_diff>
--- a/Steve-Hall-AI-Implementation-Plan.docx
+++ b/Steve-Hall-AI-Implementation-Plan.docx
@@ -176,7 +176,7 @@
           <w:sz w:val="22"/>
           <w:szCs w:val="22"/>
         </w:rPr>
-        <w:t xml:space="preserve">The baseline platform is the “Improving Executive System” (IES)—a proven AI-powered executive operating system. It connects to email, calendar, task management, and documents to create a unified command center. Each phase extends this foundation with domain-specific agents and data integrations.</w:t>
+        <w:t xml:space="preserve">The baseline platform is the “Improving Executive System” (IES)—a proven AI-powered executive operating system, deployed locally on Steve’s machine using Claude Cowork with MCP (Model Context Protocol) connectors into his Google Workspace environment. No web infrastructure or cloud deployment required—Steve gets a private, always-available AI executive assistant that connects directly to his email, calendar, documents, and task management. Each phase extends this foundation with additional MCP connectors and domain-specific capabilities.</w:t>
       </w:r>
     </w:p>
     <w:p>
@@ -190,7 +190,7 @@
           <w:sz w:val="22"/>
           <w:szCs w:val="22"/>
         </w:rPr>
-        <w:t xml:space="preserve">Steve’s existing Google Workspace environment (Gmail, Google Calendar, Google Drive) provides a strong integration foundation, reducing Phase 0 discovery scope and accelerating the initial deployment.</w:t>
+        <w:t xml:space="preserve">Steve’s existing Google Workspace environment (Gmail, Google Calendar, Google Drive) integrates directly through MCP connectors, giving the AI agent real-time access to his data without any cloud deployment or web infrastructure. Phase 0 focuses on mapping the business-specific systems beyond Google that may need custom MCP servers or data import mechanisms.</w:t>
       </w:r>
     </w:p>
     <w:p>
@@ -302,7 +302,7 @@
           <w:sz w:val="22"/>
           <w:szCs w:val="22"/>
         </w:rPr>
-        <w:t xml:space="preserve">already established as the core platform—reduces integration effort</w:t>
+        <w:t xml:space="preserve">already established—connects directly via MCP connectors</w:t>
       </w:r>
     </w:p>
     <w:p>
@@ -353,16 +353,16 @@
           <w:sz w:val="22"/>
           <w:szCs w:val="22"/>
         </w:rPr>
-        <w:t xml:space="preserve">Custom connectors and tooling </w:t>
-      </w:r>
-      <w:r>
-        <w:rPr>
-          <w:rFonts w:ascii="Khula" w:cs="Khula" w:eastAsia="Khula" w:hAnsi="Khula"/>
-          <w:color w:val="333333"/>
-          <w:sz w:val="22"/>
-          <w:szCs w:val="22"/>
-        </w:rPr>
-        <w:t xml:space="preserve">required for DMS, financial systems, and market data</w:t>
+        <w:t xml:space="preserve">Custom MCP servers or data imports </w:t>
+      </w:r>
+      <w:r>
+        <w:rPr>
+          <w:rFonts w:ascii="Khula" w:cs="Khula" w:eastAsia="Khula" w:hAnsi="Khula"/>
+          <w:color w:val="333333"/>
+          <w:sz w:val="22"/>
+          <w:szCs w:val="22"/>
+        </w:rPr>
+        <w:t xml:space="preserve">may be needed for DMS, financial systems, and market data—determined in Phase 0</w:t>
       </w:r>
     </w:p>
     <w:p>
@@ -383,16 +383,16 @@
           <w:sz w:val="22"/>
           <w:szCs w:val="22"/>
         </w:rPr>
-        <w:t xml:space="preserve">3–4 weeks total </w:t>
-      </w:r>
-      <w:r>
-        <w:rPr>
-          <w:rFonts w:ascii="Khula" w:cs="Khula" w:eastAsia="Khula" w:hAnsi="Khula"/>
-          <w:color w:val="333333"/>
-          <w:sz w:val="22"/>
-          <w:szCs w:val="22"/>
-        </w:rPr>
-        <w:t xml:space="preserve">with parallel execution across phases</w:t>
+        <w:t xml:space="preserve">4–5 weeks total </w:t>
+      </w:r>
+      <w:r>
+        <w:rPr>
+          <w:rFonts w:ascii="Khula" w:cs="Khula" w:eastAsia="Khula" w:hAnsi="Khula"/>
+          <w:color w:val="333333"/>
+          <w:sz w:val="22"/>
+          <w:szCs w:val="22"/>
+        </w:rPr>
+        <w:t xml:space="preserve">with sequential execution across phases</w:t>
       </w:r>
     </w:p>
     <w:p>
@@ -564,7 +564,7 @@
           <w:sz w:val="22"/>
           <w:szCs w:val="22"/>
         </w:rPr>
-        <w:t xml:space="preserve">Before building any agents, we need to understand where Steve’s data lives beyond Google Workspace—specifically business-specific systems, financial platforms, and market data sources. Google integrations (Gmail, Calendar, Drive) are already solved; this phase focuses on the gaps.</w:t>
+        <w:t xml:space="preserve">Before configuring any agents, we need to understand where Steve’s data lives beyond Google Workspace—specifically business-specific systems, financial platforms, and market data sources. Google Workspace connects directly through existing MCP connectors; this phase focuses on identifying what additional MCP servers need to be built or what data import mechanisms are required for everything else.</w:t>
       </w:r>
     </w:p>
     <w:p>
@@ -638,7 +638,7 @@
           <w:sz w:val="22"/>
           <w:szCs w:val="22"/>
         </w:rPr>
-        <w:t xml:space="preserve">Identify gaps where custom connectors or ETL pipelines are needed</w:t>
+        <w:t xml:space="preserve">Identify gaps where custom MCP servers, data imports, or ETL pipelines are needed</w:t>
       </w:r>
     </w:p>
     <w:p>
@@ -1149,7 +1149,7 @@
           <w:sz w:val="22"/>
           <w:szCs w:val="22"/>
         </w:rPr>
-        <w:t xml:space="preserve">— prioritized list of custom integrations needed</w:t>
+        <w:t xml:space="preserve">— prioritized list of custom MCP servers and data import mechanisms needed</w:t>
       </w:r>
     </w:p>
     <w:p>
@@ -1321,7 +1321,7 @@
           <w:sz w:val="22"/>
           <w:szCs w:val="22"/>
         </w:rPr>
-        <w:t xml:space="preserve">Stand up the core AI executive system—the “Steve Hall Command Center.” Built on Google Workspace integrations, this provides immediate daily value and becomes the platform for everything else.</w:t>
+        <w:t xml:space="preserve">Stand up the IES for Steve—the “Steve Hall Command Center.” Deployed locally via Claude Cowork with MCP connectors into Google Workspace, this provides immediate daily value and becomes the foundation for everything else.</w:t>
       </w:r>
     </w:p>
     <w:p>
@@ -1879,7 +1879,7 @@
           <w:sz w:val="22"/>
           <w:szCs w:val="22"/>
         </w:rPr>
-        <w:t xml:space="preserve">Deploy IES platform with Google Workspace integrations (Gmail, Calendar, Drive)</w:t>
+        <w:t xml:space="preserve">Deploy IES locally via Claude Cowork with Google Workspace MCP connectors (Gmail, Calendar, Drive)</w:t>
       </w:r>
     </w:p>
     <w:p>
@@ -2190,7 +2190,7 @@
           <w:sz w:val="22"/>
           <w:szCs w:val="22"/>
         </w:rPr>
-        <w:t xml:space="preserve">This phase extends the executive OS in two directions simultaneously: deep email analytics and operational automation, plus content creation and market intelligence agents. Both draw from the same Google Workspace foundation and share connector infrastructure.</w:t>
+        <w:t xml:space="preserve">This phase extends the executive OS in two directions simultaneously: deep email analytics and operational automation, plus content creation and market intelligence agents. Both leverage the same Google Workspace MCP connectors and share the IES foundation running on Claude Cowork.</w:t>
       </w:r>
     </w:p>
     <w:p>
@@ -3308,45 +3308,45 @@
           <w:sz w:val="22"/>
           <w:szCs w:val="22"/>
         </w:rPr>
-        <w:t xml:space="preserve">Email analytics pipeline (read-only Gmail access to analyze patterns)</w:t>
-      </w:r>
-    </w:p>
-    <w:p>
-      <w:pPr>
-        <w:pStyle w:val="ListParagraph"/>
-        <w:numPr>
-          <w:ilvl w:val="0"/>
-          <w:numId w:val="2"/>
-        </w:numPr>
-        <w:spacing w:before="40" w:after="40" w:line="300"/>
-      </w:pPr>
-      <w:r>
-        <w:rPr>
-          <w:rFonts w:ascii="Khula" w:cs="Khula" w:eastAsia="Khula" w:hAnsi="Khula"/>
-          <w:color w:val="333333"/>
-          <w:sz w:val="22"/>
-          <w:szCs w:val="22"/>
-        </w:rPr>
-        <w:t xml:space="preserve">Contact enrichment integration (LinkedIn, company data)</w:t>
-      </w:r>
-    </w:p>
-    <w:p>
-      <w:pPr>
-        <w:pStyle w:val="ListParagraph"/>
-        <w:numPr>
-          <w:ilvl w:val="0"/>
-          <w:numId w:val="2"/>
-        </w:numPr>
-        <w:spacing w:before="40" w:after="40" w:line="300"/>
-      </w:pPr>
-      <w:r>
-        <w:rPr>
-          <w:rFonts w:ascii="Khula" w:cs="Khula" w:eastAsia="Khula" w:hAnsi="Khula"/>
-          <w:color w:val="333333"/>
-          <w:sz w:val="22"/>
-          <w:szCs w:val="22"/>
-        </w:rPr>
-        <w:t xml:space="preserve">Event management connector (Resy, Evite, or custom)</w:t>
+        <w:t xml:space="preserve">Gmail MCP connector (read-only access to analyze communication patterns)</w:t>
+      </w:r>
+    </w:p>
+    <w:p>
+      <w:pPr>
+        <w:pStyle w:val="ListParagraph"/>
+        <w:numPr>
+          <w:ilvl w:val="0"/>
+          <w:numId w:val="2"/>
+        </w:numPr>
+        <w:spacing w:before="40" w:after="40" w:line="300"/>
+      </w:pPr>
+      <w:r>
+        <w:rPr>
+          <w:rFonts w:ascii="Khula" w:cs="Khula" w:eastAsia="Khula" w:hAnsi="Khula"/>
+          <w:color w:val="333333"/>
+          <w:sz w:val="22"/>
+          <w:szCs w:val="22"/>
+        </w:rPr>
+        <w:t xml:space="preserve">Contact enrichment MCP server or data import (LinkedIn, company data)</w:t>
+      </w:r>
+    </w:p>
+    <w:p>
+      <w:pPr>
+        <w:pStyle w:val="ListParagraph"/>
+        <w:numPr>
+          <w:ilvl w:val="0"/>
+          <w:numId w:val="2"/>
+        </w:numPr>
+        <w:spacing w:before="40" w:after="40" w:line="300"/>
+      </w:pPr>
+      <w:r>
+        <w:rPr>
+          <w:rFonts w:ascii="Khula" w:cs="Khula" w:eastAsia="Khula" w:hAnsi="Khula"/>
+          <w:color w:val="333333"/>
+          <w:sz w:val="22"/>
+          <w:szCs w:val="22"/>
+        </w:rPr>
+        <w:t xml:space="preserve">Event management MCP server or workflow (Resy, Evite, or custom)</w:t>
       </w:r>
     </w:p>
     <w:p>
@@ -3542,7 +3542,7 @@
                 <w:sz w:val="20"/>
                 <w:szCs w:val="20"/>
               </w:rPr>
-              <w:t xml:space="preserve">Weeks 2–3 | High</w:t>
+              <w:t xml:space="preserve">Weeks 3–4 | High</w:t>
             </w:r>
           </w:p>
         </w:tc>
@@ -4043,26 +4043,26 @@
           <w:sz w:val="22"/>
           <w:szCs w:val="22"/>
         </w:rPr>
-        <w:t xml:space="preserve">Document ingestion pipeline for Google Drive (PDF, Excel, various formats)</w:t>
-      </w:r>
-    </w:p>
-    <w:p>
-      <w:pPr>
-        <w:pStyle w:val="ListParagraph"/>
-        <w:numPr>
-          <w:ilvl w:val="0"/>
-          <w:numId w:val="2"/>
-        </w:numPr>
-        <w:spacing w:before="40" w:after="40" w:line="300"/>
-      </w:pPr>
-      <w:r>
-        <w:rPr>
-          <w:rFonts w:ascii="Khula" w:cs="Khula" w:eastAsia="Khula" w:hAnsi="Khula"/>
-          <w:color w:val="333333"/>
-          <w:sz w:val="22"/>
-          <w:szCs w:val="22"/>
-        </w:rPr>
-        <w:t xml:space="preserve">Dealership DMS integration for real-time operational data</w:t>
+        <w:t xml:space="preserve">Google Drive MCP connector with document parsing (PDF, Excel, various formats)</w:t>
+      </w:r>
+    </w:p>
+    <w:p>
+      <w:pPr>
+        <w:pStyle w:val="ListParagraph"/>
+        <w:numPr>
+          <w:ilvl w:val="0"/>
+          <w:numId w:val="2"/>
+        </w:numPr>
+        <w:spacing w:before="40" w:after="40" w:line="300"/>
+      </w:pPr>
+      <w:r>
+        <w:rPr>
+          <w:rFonts w:ascii="Khula" w:cs="Khula" w:eastAsia="Khula" w:hAnsi="Khula"/>
+          <w:color w:val="333333"/>
+          <w:sz w:val="22"/>
+          <w:szCs w:val="22"/>
+        </w:rPr>
+        <w:t xml:space="preserve">Dealership DMS MCP server or data import for operational data</w:t>
       </w:r>
     </w:p>
     <w:p>
@@ -4100,7 +4100,7 @@
           <w:sz w:val="22"/>
           <w:szCs w:val="22"/>
         </w:rPr>
-        <w:t xml:space="preserve">Secure document vault for acquisition-sensitive materials</w:t>
+        <w:t xml:space="preserve">Secure local document vault for acquisition-sensitive materials</w:t>
       </w:r>
     </w:p>
     <w:p>
@@ -4220,7 +4220,7 @@
                 <w:sz w:val="20"/>
                 <w:szCs w:val="20"/>
               </w:rPr>
-              <w:t xml:space="preserve">Weeks 3–4 | Very High</w:t>
+              <w:t xml:space="preserve">Weeks 4–5 | Very High</w:t>
             </w:r>
           </w:p>
         </w:tc>
@@ -4822,7 +4822,7 @@
           <w:sz w:val="22"/>
           <w:szCs w:val="22"/>
         </w:rPr>
-        <w:t xml:space="preserve">The full implementation spans approximately 3–4 weeks with aggressive parallel execution. Each phase delivers standalone value, and phases overlap significantly after the initial data discovery and executive OS foundation are in place.</w:t>
+        <w:t xml:space="preserve">The full implementation spans approximately 4–5 weeks with sequential execution. Each phase delivers standalone value and builds on the work completed in prior phases.</w:t>
       </w:r>
     </w:p>
     <w:p>
@@ -5495,7 +5495,7 @@
                 <w:sz w:val="20"/>
                 <w:szCs w:val="20"/>
               </w:rPr>
-              <w:t xml:space="preserve">Weeks 2–3</w:t>
+              <w:t xml:space="preserve">Weeks 3–4</w:t>
             </w:r>
           </w:p>
         </w:tc>
@@ -5551,7 +5551,7 @@
                 <w:sz w:val="20"/>
                 <w:szCs w:val="20"/>
               </w:rPr>
-              <w:t xml:space="preserve">Phases 0–1</w:t>
+              <w:t xml:space="preserve">Phases 0–2</w:t>
             </w:r>
           </w:p>
         </w:tc>
@@ -5639,7 +5639,7 @@
                 <w:sz w:val="20"/>
                 <w:szCs w:val="20"/>
               </w:rPr>
-              <w:t xml:space="preserve">Weeks 3–4</w:t>
+              <w:t xml:space="preserve">Weeks 4–5</w:t>
             </w:r>
           </w:p>
         </w:tc>
@@ -5759,7 +5759,7 @@
           <w:sz w:val="22"/>
           <w:szCs w:val="22"/>
         </w:rPr>
-        <w:t xml:space="preserve">Phases 2 and 3 run in parallel after Phase 1 is complete. Total engagement: 3–4 weeks.</w:t>
+        <w:t xml:space="preserve">Phases run sequentially, with each building on the prior. Total engagement: 4–5 weeks.</w:t>
       </w:r>
     </w:p>
     <w:sectPr>

</xml_diff>